<commit_message>
Cleaning top coding repo
</commit_message>
<xml_diff>
--- a/lit_review/top_coding_updates.docx
+++ b/lit_review/top_coding_updates.docx
@@ -4634,7 +4634,25 @@
             <w:i/>
             <w:iCs/>
           </w:rPr>
-          <w:t>Top and Bottom Coding at LIS</w:t>
+          <w:t>Top and Bot</w:t>
+        </w:r>
+        <w:r>
+          <w:rPr>
+            <w:rStyle w:val="Hyperlink"/>
+            <w:rFonts w:ascii="Times New Roman" w:hAnsi="Times New Roman" w:cs="Times New Roman"/>
+            <w:i/>
+            <w:iCs/>
+          </w:rPr>
+          <w:t>t</w:t>
+        </w:r>
+        <w:r>
+          <w:rPr>
+            <w:rStyle w:val="Hyperlink"/>
+            <w:rFonts w:ascii="Times New Roman" w:hAnsi="Times New Roman" w:cs="Times New Roman"/>
+            <w:i/>
+            <w:iCs/>
+          </w:rPr>
+          <w:t>om Coding at LIS</w:t>
         </w:r>
       </w:hyperlink>
       <w:r>
@@ -28579,6 +28597,589 @@
           <w:rFonts w:ascii="Times New Roman" w:hAnsi="Times New Roman" w:cs="Times New Roman"/>
         </w:rPr>
         <w:t>for Malawi 1997.</w:t>
+      </w:r>
+    </w:p>
+    <w:p>
+      <w:pPr>
+        <w:pStyle w:val="ListParagraph"/>
+        <w:numPr>
+          <w:ilvl w:val="0"/>
+          <w:numId w:val="17"/>
+        </w:numPr>
+        <w:rPr>
+          <w:rFonts w:ascii="Times New Roman" w:hAnsi="Times New Roman" w:cs="Times New Roman"/>
+        </w:rPr>
+      </w:pPr>
+      <w:r>
+        <w:rPr>
+          <w:rFonts w:ascii="Times New Roman" w:hAnsi="Times New Roman" w:cs="Times New Roman"/>
+        </w:rPr>
+        <w:t xml:space="preserve">(Nishant) </w:t>
+      </w:r>
+      <w:r>
+        <w:rPr>
+          <w:rFonts w:ascii="Times New Roman" w:hAnsi="Times New Roman" w:cs="Times New Roman"/>
+        </w:rPr>
+        <w:t xml:space="preserve">We could try to do this like we fit Pareto. For instance, remove the top x values. Fit the GB2 and see how far these fitted values are from the actual data. This could be another exercise to what Yuki suggested yesterday: find the fitted values of the top using household and demographic characteristics and see the difference from actual values. In short, I think we have at least three approaches to understand how extreme the outliers are: (a) Pareto, (b) GB2, and (c) regression.  </w:t>
+      </w:r>
+    </w:p>
+    <w:p>
+      <w:pPr>
+        <w:rPr>
+          <w:rFonts w:ascii="Times New Roman" w:hAnsi="Times New Roman" w:cs="Times New Roman"/>
+        </w:rPr>
+      </w:pPr>
+    </w:p>
+    <w:p>
+      <w:pPr>
+        <w:rPr>
+          <w:rFonts w:ascii="Times New Roman" w:hAnsi="Times New Roman" w:cs="Times New Roman"/>
+          <w:b/>
+          <w:bCs/>
+          <w:u w:val="single"/>
+        </w:rPr>
+      </w:pPr>
+      <w:r>
+        <w:rPr>
+          <w:rFonts w:ascii="Times New Roman" w:hAnsi="Times New Roman" w:cs="Times New Roman"/>
+          <w:b/>
+          <w:bCs/>
+        </w:rPr>
+        <w:t>Updates</w:t>
+      </w:r>
+      <w:r>
+        <w:rPr>
+          <w:rFonts w:ascii="Times New Roman" w:hAnsi="Times New Roman" w:cs="Times New Roman"/>
+          <w:b/>
+          <w:bCs/>
+        </w:rPr>
+        <w:t xml:space="preserve">: </w:t>
+      </w:r>
+      <w:r>
+        <w:rPr>
+          <w:rFonts w:ascii="Times New Roman" w:hAnsi="Times New Roman" w:cs="Times New Roman"/>
+          <w:b/>
+          <w:bCs/>
+          <w:u w:val="single"/>
+        </w:rPr>
+        <w:t>September</w:t>
+      </w:r>
+      <w:r>
+        <w:rPr>
+          <w:rFonts w:ascii="Times New Roman" w:hAnsi="Times New Roman" w:cs="Times New Roman"/>
+          <w:b/>
+          <w:bCs/>
+          <w:u w:val="single"/>
+        </w:rPr>
+        <w:t xml:space="preserve"> 1</w:t>
+      </w:r>
+      <w:r>
+        <w:rPr>
+          <w:rFonts w:ascii="Times New Roman" w:hAnsi="Times New Roman" w:cs="Times New Roman"/>
+          <w:b/>
+          <w:bCs/>
+          <w:u w:val="single"/>
+        </w:rPr>
+        <w:t>1</w:t>
+      </w:r>
+      <w:r>
+        <w:rPr>
+          <w:rFonts w:ascii="Times New Roman" w:hAnsi="Times New Roman" w:cs="Times New Roman"/>
+          <w:b/>
+          <w:bCs/>
+          <w:u w:val="single"/>
+        </w:rPr>
+        <w:t>, 2026</w:t>
+      </w:r>
+    </w:p>
+    <w:p>
+      <w:pPr>
+        <w:rPr>
+          <w:rFonts w:ascii="Times New Roman" w:hAnsi="Times New Roman" w:cs="Times New Roman"/>
+        </w:rPr>
+      </w:pPr>
+      <w:r>
+        <w:rPr>
+          <w:rFonts w:ascii="Times New Roman" w:hAnsi="Times New Roman" w:cs="Times New Roman"/>
+        </w:rPr>
+        <w:t>Idea for</w:t>
+      </w:r>
+      <w:r>
+        <w:rPr>
+          <w:rFonts w:ascii="Times New Roman" w:hAnsi="Times New Roman" w:cs="Times New Roman"/>
+        </w:rPr>
+        <w:t xml:space="preserve"> Wednesday’s presentation</w:t>
+      </w:r>
+      <w:r>
+        <w:rPr>
+          <w:rFonts w:ascii="Times New Roman" w:hAnsi="Times New Roman" w:cs="Times New Roman"/>
+        </w:rPr>
+        <w:t>:</w:t>
+      </w:r>
+    </w:p>
+    <w:p>
+      <w:pPr>
+        <w:rPr>
+          <w:rFonts w:ascii="Times New Roman" w:hAnsi="Times New Roman" w:cs="Times New Roman"/>
+          <w:b/>
+          <w:bCs/>
+        </w:rPr>
+      </w:pPr>
+      <w:r>
+        <w:rPr>
+          <w:rFonts w:ascii="Times New Roman" w:hAnsi="Times New Roman" w:cs="Times New Roman"/>
+          <w:b/>
+          <w:bCs/>
+        </w:rPr>
+        <w:t>Project narrative: how to present it</w:t>
+      </w:r>
+    </w:p>
+    <w:p>
+      <w:pPr>
+        <w:numPr>
+          <w:ilvl w:val="0"/>
+          <w:numId w:val="18"/>
+        </w:numPr>
+        <w:rPr>
+          <w:rFonts w:ascii="Times New Roman" w:hAnsi="Times New Roman" w:cs="Times New Roman"/>
+        </w:rPr>
+      </w:pPr>
+      <w:r>
+        <w:rPr>
+          <w:rFonts w:ascii="Times New Roman" w:hAnsi="Times New Roman" w:cs="Times New Roman"/>
+          <w:b/>
+          <w:bCs/>
+        </w:rPr>
+        <w:t xml:space="preserve">We started with a literature review to understand how different frameworks treat upper-tail values </w:t>
+      </w:r>
+      <w:r>
+        <w:rPr>
+          <w:rFonts w:ascii="Times New Roman" w:hAnsi="Times New Roman" w:cs="Times New Roman"/>
+          <w:b/>
+          <w:bCs/>
+        </w:rPr>
+        <w:t xml:space="preserve">- </w:t>
+      </w:r>
+      <w:r>
+        <w:rPr>
+          <w:rFonts w:ascii="Times New Roman" w:hAnsi="Times New Roman" w:cs="Times New Roman"/>
+          <w:b/>
+          <w:bCs/>
+        </w:rPr>
+        <w:t>LIS, CPS, EU-SILC, and WID.</w:t>
+      </w:r>
+      <w:r>
+        <w:rPr>
+          <w:rFonts w:ascii="Times New Roman" w:hAnsi="Times New Roman" w:cs="Times New Roman"/>
+        </w:rPr>
+        <w:br/>
+        <w:t>Each has a different objective: LIS uses a transparent log-IQR rule; CPS is driven by disclosure avoidance, not statistical validity; EU-SILC (Van Kerm) compares trimming/winsorizing/Pareto approaches; WID goes the opposite direction, correcting for </w:t>
+      </w:r>
+      <w:r>
+        <w:rPr>
+          <w:rFonts w:ascii="Times New Roman" w:hAnsi="Times New Roman" w:cs="Times New Roman"/>
+          <w:i/>
+          <w:iCs/>
+        </w:rPr>
+        <w:t>underrepresentation</w:t>
+      </w:r>
+      <w:r>
+        <w:rPr>
+          <w:rFonts w:ascii="Times New Roman" w:hAnsi="Times New Roman" w:cs="Times New Roman"/>
+        </w:rPr>
+        <w:t> of the rich by blending survey and tax data.</w:t>
+      </w:r>
+    </w:p>
+    <w:p>
+      <w:pPr>
+        <w:numPr>
+          <w:ilvl w:val="0"/>
+          <w:numId w:val="18"/>
+        </w:numPr>
+        <w:rPr>
+          <w:rFonts w:ascii="Times New Roman" w:hAnsi="Times New Roman" w:cs="Times New Roman"/>
+        </w:rPr>
+      </w:pPr>
+      <w:r>
+        <w:rPr>
+          <w:rFonts w:ascii="Times New Roman" w:hAnsi="Times New Roman" w:cs="Times New Roman"/>
+          <w:b/>
+          <w:bCs/>
+        </w:rPr>
+        <w:t xml:space="preserve">We applied the LIS rule to all 1,825 surveys and found 24 cases where a </w:t>
+      </w:r>
+      <w:r>
+        <w:rPr>
+          <w:rFonts w:ascii="Times New Roman" w:hAnsi="Times New Roman" w:cs="Times New Roman"/>
+          <w:b/>
+          <w:bCs/>
+        </w:rPr>
+        <w:t>small</w:t>
+      </w:r>
+      <w:r>
+        <w:rPr>
+          <w:rFonts w:ascii="Times New Roman" w:hAnsi="Times New Roman" w:cs="Times New Roman"/>
+          <w:b/>
+          <w:bCs/>
+        </w:rPr>
+        <w:t xml:space="preserve"> share of the population accounts for a disproportionately large share of total welfare.</w:t>
+      </w:r>
+      <w:r>
+        <w:rPr>
+          <w:rFonts w:ascii="Times New Roman" w:hAnsi="Times New Roman" w:cs="Times New Roman"/>
+        </w:rPr>
+        <w:br/>
+        <w:t>Threshold: </w:t>
+      </w:r>
+      <m:oMath>
+        <m:r>
+          <w:rPr>
+            <w:rFonts w:ascii="Cambria Math" w:hAnsi="Cambria Math" w:cs="Times New Roman"/>
+          </w:rPr>
+          <m:t>c=</m:t>
+        </m:r>
+        <m:r>
+          <m:rPr>
+            <m:sty m:val="p"/>
+          </m:rPr>
+          <w:rPr>
+            <w:rFonts w:ascii="Cambria Math" w:hAnsi="Cambria Math" w:cs="Times New Roman"/>
+          </w:rPr>
+          <m:t>exp</m:t>
+        </m:r>
+        <m:r>
+          <w:rPr>
+            <w:rFonts w:ascii="Cambria Math" w:hAnsi="Cambria Math" w:cs="Times New Roman"/>
+          </w:rPr>
+          <m:t>⁡[</m:t>
+        </m:r>
+        <m:sSub>
+          <m:sSubPr>
+            <m:ctrlPr>
+              <w:rPr>
+                <w:rFonts w:ascii="Cambria Math" w:hAnsi="Cambria Math" w:cs="Times New Roman"/>
+              </w:rPr>
+            </m:ctrlPr>
+          </m:sSubPr>
+          <m:e>
+            <m:r>
+              <w:rPr>
+                <w:rFonts w:ascii="Cambria Math" w:hAnsi="Cambria Math" w:cs="Times New Roman"/>
+              </w:rPr>
+              <m:t>Q</m:t>
+            </m:r>
+          </m:e>
+          <m:sub>
+            <m:r>
+              <w:rPr>
+                <w:rFonts w:ascii="Cambria Math" w:hAnsi="Cambria Math" w:cs="Times New Roman"/>
+              </w:rPr>
+              <m:t>0.75</m:t>
+            </m:r>
+          </m:sub>
+        </m:sSub>
+        <m:r>
+          <w:rPr>
+            <w:rFonts w:ascii="Cambria Math" w:hAnsi="Cambria Math" w:cs="Times New Roman"/>
+          </w:rPr>
+          <m:t>(</m:t>
+        </m:r>
+        <m:r>
+          <m:rPr>
+            <m:sty m:val="p"/>
+          </m:rPr>
+          <w:rPr>
+            <w:rFonts w:ascii="Cambria Math" w:hAnsi="Cambria Math" w:cs="Times New Roman"/>
+          </w:rPr>
+          <m:t>ln</m:t>
+        </m:r>
+        <m:r>
+          <w:rPr>
+            <w:rFonts w:ascii="Cambria Math" w:hAnsi="Cambria Math" w:cs="Times New Roman"/>
+          </w:rPr>
+          <m:t>⁡y)+3×IQR(</m:t>
+        </m:r>
+        <m:r>
+          <m:rPr>
+            <m:sty m:val="p"/>
+          </m:rPr>
+          <w:rPr>
+            <w:rFonts w:ascii="Cambria Math" w:hAnsi="Cambria Math" w:cs="Times New Roman"/>
+          </w:rPr>
+          <m:t>ln</m:t>
+        </m:r>
+        <m:r>
+          <w:rPr>
+            <w:rFonts w:ascii="Cambria Math" w:hAnsi="Cambria Math" w:cs="Times New Roman"/>
+          </w:rPr>
+          <m:t>⁡y)]</m:t>
+        </m:r>
+      </m:oMath>
+      <w:r>
+        <w:rPr>
+          <w:rFonts w:ascii="Times New Roman" w:hAnsi="Times New Roman" w:cs="Times New Roman"/>
+        </w:rPr>
+        <w:t>. In all 24 flagged surveys, less than 0.5% of the population sits above the ceiling, yet in several cases (led by Malawi 1997) that group holds over 40% of total measured welfare.</w:t>
+      </w:r>
+      <w:r>
+        <w:rPr>
+          <w:rFonts w:ascii="Times New Roman" w:hAnsi="Times New Roman" w:cs="Times New Roman"/>
+        </w:rPr>
+        <w:t xml:space="preserve"> Criteria: </w:t>
+      </w:r>
+      <w:r>
+        <w:rPr>
+          <w:rFonts w:ascii="Times New Roman" w:hAnsi="Times New Roman" w:cs="Times New Roman"/>
+        </w:rPr>
+        <w:t xml:space="preserve">surveys where the population above the ceiling holds ≥5% of total </w:t>
+      </w:r>
+      <w:r>
+        <w:rPr>
+          <w:rFonts w:ascii="Times New Roman" w:hAnsi="Times New Roman" w:cs="Times New Roman"/>
+        </w:rPr>
+        <w:t>welfare.</w:t>
+      </w:r>
+    </w:p>
+    <w:p>
+      <w:pPr>
+        <w:numPr>
+          <w:ilvl w:val="0"/>
+          <w:numId w:val="18"/>
+        </w:numPr>
+        <w:rPr>
+          <w:rFonts w:ascii="Times New Roman" w:hAnsi="Times New Roman" w:cs="Times New Roman"/>
+        </w:rPr>
+      </w:pPr>
+      <w:r>
+        <w:rPr>
+          <w:rFonts w:ascii="Times New Roman" w:hAnsi="Times New Roman" w:cs="Times New Roman"/>
+          <w:b/>
+          <w:bCs/>
+        </w:rPr>
+        <w:t>To make sure this wasn't just an artifact of the LIS rule, we applied a second, independent method — Stata's outdetect procedure, reimplemented in Python</w:t>
+      </w:r>
+      <w:r>
+        <w:rPr>
+          <w:rFonts w:ascii="Times New Roman" w:hAnsi="Times New Roman" w:cs="Times New Roman"/>
+          <w:b/>
+          <w:bCs/>
+        </w:rPr>
+        <w:t xml:space="preserve">. </w:t>
+      </w:r>
+      <w:r>
+        <w:rPr>
+          <w:rFonts w:ascii="Times New Roman" w:hAnsi="Times New Roman" w:cs="Times New Roman"/>
+        </w:rPr>
+        <w:t>O</w:t>
+      </w:r>
+      <w:r>
+        <w:rPr>
+          <w:rFonts w:ascii="Times New Roman" w:hAnsi="Times New Roman" w:cs="Times New Roman"/>
+        </w:rPr>
+        <w:t>utdetect uses an unweighted median + S-estimator (a robust scale estimator), which is methodologically distinct from LIS's log-IQR approach</w:t>
+      </w:r>
+      <w:r>
+        <w:rPr>
+          <w:rFonts w:ascii="Times New Roman" w:hAnsi="Times New Roman" w:cs="Times New Roman"/>
+        </w:rPr>
+        <w:t xml:space="preserve">. </w:t>
+      </w:r>
+      <w:r>
+        <w:rPr>
+          <w:rFonts w:ascii="Times New Roman" w:hAnsi="Times New Roman" w:cs="Times New Roman"/>
+        </w:rPr>
+        <w:t>W</w:t>
+      </w:r>
+      <w:r>
+        <w:rPr>
+          <w:rFonts w:ascii="Times New Roman" w:hAnsi="Times New Roman" w:cs="Times New Roman"/>
+        </w:rPr>
+        <w:t>e applied the same 5% welfare-share criterion to the observations flagged by the Python implementation of</w:t>
+      </w:r>
+      <w:r>
+        <w:rPr>
+          <w:rFonts w:ascii="Times New Roman" w:hAnsi="Times New Roman" w:cs="Times New Roman"/>
+        </w:rPr>
+        <w:t xml:space="preserve"> </w:t>
+      </w:r>
+      <w:r>
+        <w:rPr>
+          <w:rFonts w:ascii="Times New Roman" w:hAnsi="Times New Roman" w:cs="Times New Roman"/>
+        </w:rPr>
+        <w:t>Stata’s outdetect procedure. Using its recommended robust z-score threshold of 3, outdetect identified 398 surveys where flagged observations accounted for at least 5% of total welfare. All 24 surveys identified by LIS were included in this group, together with 374 additional surveys.</w:t>
+      </w:r>
+      <w:r>
+        <w:rPr>
+          <w:rFonts w:ascii="Times New Roman" w:hAnsi="Times New Roman" w:cs="Times New Roman"/>
+        </w:rPr>
+        <w:t xml:space="preserve"> </w:t>
+      </w:r>
+      <w:r>
+        <w:rPr>
+          <w:rFonts w:ascii="Times New Roman" w:hAnsi="Times New Roman" w:cs="Times New Roman"/>
+        </w:rPr>
+        <w:t>As an alternative criterion, we used a 1% population-share threshold. This is an empirical reference</w:t>
+      </w:r>
+      <w:r>
+        <w:rPr>
+          <w:rFonts w:ascii="Times New Roman" w:hAnsi="Times New Roman" w:cs="Times New Roman"/>
+        </w:rPr>
+        <w:t xml:space="preserve"> point</w:t>
+      </w:r>
+      <w:r>
+        <w:rPr>
+          <w:rFonts w:ascii="Times New Roman" w:hAnsi="Times New Roman" w:cs="Times New Roman"/>
+        </w:rPr>
+        <w:t xml:space="preserve"> based on the outdetect documentation, not an official survey-level cutoff. Under this criterion, 143 surveys were flagged, including 5 </w:t>
+      </w:r>
+      <w:r>
+        <w:rPr>
+          <w:rFonts w:ascii="Times New Roman" w:hAnsi="Times New Roman" w:cs="Times New Roman"/>
+        </w:rPr>
+        <w:lastRenderedPageBreak/>
+        <w:t xml:space="preserve">of the 24 LIS surveys: </w:t>
+      </w:r>
+      <w:r>
+        <w:rPr>
+          <w:rFonts w:ascii="Times New Roman" w:hAnsi="Times New Roman" w:cs="Times New Roman"/>
+        </w:rPr>
+        <w:t>Comoros 2004, Malawi 1997, Rwanda 2000, Rwanda 2005, and Rwanda 2013</w:t>
+      </w:r>
+      <w:r>
+        <w:rPr>
+          <w:rFonts w:ascii="Times New Roman" w:hAnsi="Times New Roman" w:cs="Times New Roman"/>
+        </w:rPr>
+        <w:t>.</w:t>
+      </w:r>
+    </w:p>
+    <w:p>
+      <w:pPr>
+        <w:pStyle w:val="ListParagraph"/>
+        <w:numPr>
+          <w:ilvl w:val="0"/>
+          <w:numId w:val="18"/>
+        </w:numPr>
+        <w:rPr>
+          <w:rFonts w:ascii="Times New Roman" w:hAnsi="Times New Roman" w:cs="Times New Roman"/>
+        </w:rPr>
+      </w:pPr>
+      <w:r>
+        <w:rPr>
+          <w:rFonts w:ascii="Times New Roman" w:hAnsi="Times New Roman" w:cs="Times New Roman"/>
+          <w:b/>
+          <w:bCs/>
+        </w:rPr>
+        <w:t xml:space="preserve">We then fitted Pareto distributions to the upper tails of the most extreme cases. </w:t>
+      </w:r>
+      <w:r>
+        <w:rPr>
+          <w:rFonts w:ascii="Times New Roman" w:hAnsi="Times New Roman" w:cs="Times New Roman"/>
+        </w:rPr>
+        <w:t>The analysis showed substantial deviations between the largest observed values and the fitted Pareto pattern, providing additional evidence that these observations were not simply large values from an otherwise regular tail.</w:t>
+      </w:r>
+    </w:p>
+    <w:p>
+      <w:pPr>
+        <w:numPr>
+          <w:ilvl w:val="0"/>
+          <w:numId w:val="18"/>
+        </w:numPr>
+        <w:rPr>
+          <w:rFonts w:ascii="Times New Roman" w:hAnsi="Times New Roman" w:cs="Times New Roman"/>
+          <w:b/>
+          <w:bCs/>
+        </w:rPr>
+      </w:pPr>
+      <w:r>
+        <w:rPr>
+          <w:rFonts w:ascii="Times New Roman" w:hAnsi="Times New Roman" w:cs="Times New Roman"/>
+          <w:b/>
+          <w:bCs/>
+        </w:rPr>
+        <w:t>We used Malawi 1997 as a deep-dive case study to show how the headline indicators respond to different treatments of extreme welfare values, using the same GMD source throughout.</w:t>
+      </w:r>
+      <w:r>
+        <w:rPr>
+          <w:rFonts w:ascii="Times New Roman" w:hAnsi="Times New Roman" w:cs="Times New Roman"/>
+          <w:b/>
+          <w:bCs/>
+        </w:rPr>
+        <w:t xml:space="preserve"> </w:t>
+      </w:r>
+      <w:r>
+        <w:rPr>
+          <w:rFonts w:ascii="Times New Roman" w:hAnsi="Times New Roman" w:cs="Times New Roman"/>
+        </w:rPr>
+        <w:t>Under the LIS correction, 59 records, representing 0.43% of the population, account for 41.6% of total welfare. Capping these observations reduces the mean by 38%, the Gini by 32%, the MLD by 59%, and Atkinson(2) by 33%. The outdetect correction, which caps 225 observations, produces larger reductions: 42% in the mean, 37% in the Gini, 65% in the MLD, and 39% in Atkinson(2). As a simpler sensitivity check, removing only the two most extreme observations reduces the mean by 34%, the Gini by 27%, the MLD by 52%, and Atkinson(2) by 28%. This shows that extreme observations substantially affect inequality and mean estimates, while poverty estimates remain comparatively stable.</w:t>
+      </w:r>
+    </w:p>
+    <w:p>
+      <w:pPr>
+        <w:numPr>
+          <w:ilvl w:val="0"/>
+          <w:numId w:val="18"/>
+        </w:numPr>
+        <w:rPr>
+          <w:rFonts w:ascii="Times New Roman" w:hAnsi="Times New Roman" w:cs="Times New Roman"/>
+        </w:rPr>
+      </w:pPr>
+      <w:r>
+        <w:rPr>
+          <w:rFonts w:ascii="Times New Roman" w:hAnsi="Times New Roman" w:cs="Times New Roman"/>
+          <w:b/>
+          <w:bCs/>
+        </w:rPr>
+        <w:t>As next steps, we're proposing two additional analyses to understand the underlying nature of these outliers: are they statistically implausible under a GB2 distribution? Are they explainable by household characteristics via regression, or are they genuinely anomalous?"</w:t>
+      </w:r>
+    </w:p>
+    <w:p>
+      <w:pPr>
+        <w:numPr>
+          <w:ilvl w:val="1"/>
+          <w:numId w:val="18"/>
+        </w:numPr>
+        <w:rPr>
+          <w:rFonts w:ascii="Times New Roman" w:hAnsi="Times New Roman" w:cs="Times New Roman"/>
+        </w:rPr>
+      </w:pPr>
+      <w:r>
+        <w:rPr>
+          <w:rFonts w:ascii="Times New Roman" w:hAnsi="Times New Roman" w:cs="Times New Roman"/>
+          <w:b/>
+          <w:bCs/>
+        </w:rPr>
+        <w:t>GB2</w:t>
+      </w:r>
+      <w:r>
+        <w:rPr>
+          <w:rFonts w:ascii="Times New Roman" w:hAnsi="Times New Roman" w:cs="Times New Roman"/>
+        </w:rPr>
+        <w:t>: fit a Generalized Beta of the Second Kind excluding the top-x values, then check how far the actual observed values fall from the fitted distribution.</w:t>
+      </w:r>
+    </w:p>
+    <w:p>
+      <w:pPr>
+        <w:numPr>
+          <w:ilvl w:val="1"/>
+          <w:numId w:val="18"/>
+        </w:numPr>
+        <w:rPr>
+          <w:rFonts w:ascii="Times New Roman" w:hAnsi="Times New Roman" w:cs="Times New Roman"/>
+        </w:rPr>
+      </w:pPr>
+      <w:r>
+        <w:rPr>
+          <w:rFonts w:ascii="Times New Roman" w:hAnsi="Times New Roman" w:cs="Times New Roman"/>
+          <w:b/>
+          <w:bCs/>
+        </w:rPr>
+        <w:t>Regression</w:t>
+      </w:r>
+      <w:r>
+        <w:rPr>
+          <w:rFonts w:ascii="Times New Roman" w:hAnsi="Times New Roman" w:cs="Times New Roman"/>
+        </w:rPr>
+        <w:t>: predict welfare/consumption from household characteristics (roof material, water access, education, etc.) and compare fitted vs. actual values to flag households whose reported welfare looks inconsistent with their observed characteristics.</w:t>
       </w:r>
     </w:p>
     <w:p>
@@ -31413,6 +32014,123 @@
       </w:rPr>
     </w:lvl>
   </w:abstractNum>
+  <w:abstractNum w:abstractNumId="17" w15:restartNumberingAfterBreak="0">
+    <w:nsid w:val="7C993FD2"/>
+    <w:multiLevelType w:val="multilevel"/>
+    <w:tmpl w:val="3F587AE2"/>
+    <w:lvl w:ilvl="0">
+      <w:start w:val="1"/>
+      <w:numFmt w:val="decimal"/>
+      <w:lvlText w:val="%1."/>
+      <w:lvlJc w:val="left"/>
+      <w:pPr>
+        <w:tabs>
+          <w:tab w:val="num" w:pos="720"/>
+        </w:tabs>
+        <w:ind w:left="720" w:hanging="360"/>
+      </w:pPr>
+    </w:lvl>
+    <w:lvl w:ilvl="1">
+      <w:start w:val="1"/>
+      <w:numFmt w:val="bullet"/>
+      <w:lvlText w:val="o"/>
+      <w:lvlJc w:val="left"/>
+      <w:pPr>
+        <w:tabs>
+          <w:tab w:val="num" w:pos="1440"/>
+        </w:tabs>
+        <w:ind w:left="1440" w:hanging="360"/>
+      </w:pPr>
+      <w:rPr>
+        <w:rFonts w:ascii="Courier New" w:hAnsi="Courier New" w:hint="default"/>
+        <w:sz w:val="20"/>
+      </w:rPr>
+    </w:lvl>
+    <w:lvl w:ilvl="2" w:tentative="1">
+      <w:start w:val="1"/>
+      <w:numFmt w:val="decimal"/>
+      <w:lvlText w:val="%3."/>
+      <w:lvlJc w:val="left"/>
+      <w:pPr>
+        <w:tabs>
+          <w:tab w:val="num" w:pos="2160"/>
+        </w:tabs>
+        <w:ind w:left="2160" w:hanging="360"/>
+      </w:pPr>
+    </w:lvl>
+    <w:lvl w:ilvl="3" w:tentative="1">
+      <w:start w:val="1"/>
+      <w:numFmt w:val="decimal"/>
+      <w:lvlText w:val="%4."/>
+      <w:lvlJc w:val="left"/>
+      <w:pPr>
+        <w:tabs>
+          <w:tab w:val="num" w:pos="2880"/>
+        </w:tabs>
+        <w:ind w:left="2880" w:hanging="360"/>
+      </w:pPr>
+    </w:lvl>
+    <w:lvl w:ilvl="4" w:tentative="1">
+      <w:start w:val="1"/>
+      <w:numFmt w:val="decimal"/>
+      <w:lvlText w:val="%5."/>
+      <w:lvlJc w:val="left"/>
+      <w:pPr>
+        <w:tabs>
+          <w:tab w:val="num" w:pos="3600"/>
+        </w:tabs>
+        <w:ind w:left="3600" w:hanging="360"/>
+      </w:pPr>
+    </w:lvl>
+    <w:lvl w:ilvl="5" w:tentative="1">
+      <w:start w:val="1"/>
+      <w:numFmt w:val="decimal"/>
+      <w:lvlText w:val="%6."/>
+      <w:lvlJc w:val="left"/>
+      <w:pPr>
+        <w:tabs>
+          <w:tab w:val="num" w:pos="4320"/>
+        </w:tabs>
+        <w:ind w:left="4320" w:hanging="360"/>
+      </w:pPr>
+    </w:lvl>
+    <w:lvl w:ilvl="6" w:tentative="1">
+      <w:start w:val="1"/>
+      <w:numFmt w:val="decimal"/>
+      <w:lvlText w:val="%7."/>
+      <w:lvlJc w:val="left"/>
+      <w:pPr>
+        <w:tabs>
+          <w:tab w:val="num" w:pos="5040"/>
+        </w:tabs>
+        <w:ind w:left="5040" w:hanging="360"/>
+      </w:pPr>
+    </w:lvl>
+    <w:lvl w:ilvl="7" w:tentative="1">
+      <w:start w:val="1"/>
+      <w:numFmt w:val="decimal"/>
+      <w:lvlText w:val="%8."/>
+      <w:lvlJc w:val="left"/>
+      <w:pPr>
+        <w:tabs>
+          <w:tab w:val="num" w:pos="5760"/>
+        </w:tabs>
+        <w:ind w:left="5760" w:hanging="360"/>
+      </w:pPr>
+    </w:lvl>
+    <w:lvl w:ilvl="8" w:tentative="1">
+      <w:start w:val="1"/>
+      <w:numFmt w:val="decimal"/>
+      <w:lvlText w:val="%9."/>
+      <w:lvlJc w:val="left"/>
+      <w:pPr>
+        <w:tabs>
+          <w:tab w:val="num" w:pos="6480"/>
+        </w:tabs>
+        <w:ind w:left="6480" w:hanging="360"/>
+      </w:pPr>
+    </w:lvl>
+  </w:abstractNum>
   <w:num w:numId="1" w16cid:durableId="1857695760">
     <w:abstractNumId w:val="11"/>
   </w:num>
@@ -31463,6 +32181,9 @@
   </w:num>
   <w:num w:numId="17" w16cid:durableId="1858502340">
     <w:abstractNumId w:val="3"/>
+  </w:num>
+  <w:num w:numId="18" w16cid:durableId="1330865510">
+    <w:abstractNumId w:val="17"/>
   </w:num>
 </w:numbering>
 </file>
@@ -31878,7 +32599,7 @@
   <w:style w:type="paragraph" w:default="1" w:styleId="Normal">
     <w:name w:val="Normal"/>
     <w:qFormat/>
-    <w:rsid w:val="00C931DF"/>
+    <w:rsid w:val="00ED1A88"/>
   </w:style>
   <w:style w:type="paragraph" w:styleId="Heading1">
     <w:name w:val="heading 1"/>

</xml_diff>